<commit_message>
modifica funzione visualizza_ordini e ordini.html in modo da poter vedere la cronologia degli ordini
</commit_message>
<xml_diff>
--- a/2023-2024/Basi di Dati/Progetto/RELAZIONE PROGETTO E.docx
+++ b/2023-2024/Basi di Dati/Progetto/RELAZIONE PROGETTO E.docx
@@ -59,7 +59,7 @@
           <w:r>
             <w:fldChar w:fldCharType="separate"/>
           </w:r>
-          <w:hyperlink w:anchor="_Toc172986042" w:history="1">
+          <w:hyperlink w:anchor="_Toc173135889" w:history="1">
             <w:r>
               <w:rPr>
                 <w:rStyle w:val="Collegamentoipertestuale"/>
@@ -101,7 +101,7 @@
                 <w:noProof/>
                 <w:webHidden/>
               </w:rPr>
-              <w:instrText xml:space="preserve"> PAGEREF _Toc172986042 \h </w:instrText>
+              <w:instrText xml:space="preserve"> PAGEREF _Toc173135889 \h </w:instrText>
             </w:r>
             <w:r>
               <w:rPr>
@@ -145,7 +145,7 @@
               <w:lang w:eastAsia="it-IT"/>
             </w:rPr>
           </w:pPr>
-          <w:hyperlink w:anchor="_Toc172986043" w:history="1">
+          <w:hyperlink w:anchor="_Toc173135890" w:history="1">
             <w:r>
               <w:rPr>
                 <w:rStyle w:val="Collegamentoipertestuale"/>
@@ -187,7 +187,7 @@
                 <w:noProof/>
                 <w:webHidden/>
               </w:rPr>
-              <w:instrText xml:space="preserve"> PAGEREF _Toc172986043 \h </w:instrText>
+              <w:instrText xml:space="preserve"> PAGEREF _Toc173135890 \h </w:instrText>
             </w:r>
             <w:r>
               <w:rPr>
@@ -231,7 +231,7 @@
               <w:lang w:eastAsia="it-IT"/>
             </w:rPr>
           </w:pPr>
-          <w:hyperlink w:anchor="_Toc172986044" w:history="1">
+          <w:hyperlink w:anchor="_Toc173135891" w:history="1">
             <w:r>
               <w:rPr>
                 <w:rStyle w:val="Collegamentoipertestuale"/>
@@ -273,7 +273,7 @@
                 <w:noProof/>
                 <w:webHidden/>
               </w:rPr>
-              <w:instrText xml:space="preserve"> PAGEREF _Toc172986044 \h </w:instrText>
+              <w:instrText xml:space="preserve"> PAGEREF _Toc173135891 \h </w:instrText>
             </w:r>
             <w:r>
               <w:rPr>
@@ -311,10 +311,12 @@
               <w:tab w:val="right" w:leader="dot" w:pos="9628"/>
             </w:tabs>
             <w:rPr>
+              <w:rFonts w:eastAsiaTheme="minorEastAsia"/>
               <w:noProof/>
+              <w:lang w:eastAsia="it-IT"/>
             </w:rPr>
           </w:pPr>
-          <w:hyperlink w:anchor="_Toc172986045" w:history="1">
+          <w:hyperlink w:anchor="_Toc173135892" w:history="1">
             <w:r>
               <w:rPr>
                 <w:rStyle w:val="Collegamentoipertestuale"/>
@@ -341,7 +343,7 @@
                 <w:noProof/>
                 <w:webHidden/>
               </w:rPr>
-              <w:instrText xml:space="preserve"> PAGEREF _Toc172986045 \h </w:instrText>
+              <w:instrText xml:space="preserve"> PAGEREF _Toc173135892 \h </w:instrText>
             </w:r>
             <w:r>
               <w:rPr>
@@ -379,10 +381,12 @@
               <w:tab w:val="right" w:leader="dot" w:pos="9628"/>
             </w:tabs>
             <w:rPr>
+              <w:rFonts w:eastAsiaTheme="minorEastAsia"/>
               <w:noProof/>
+              <w:lang w:eastAsia="it-IT"/>
             </w:rPr>
           </w:pPr>
-          <w:hyperlink w:anchor="_Toc172986046" w:history="1">
+          <w:hyperlink w:anchor="_Toc173135893" w:history="1">
             <w:r>
               <w:rPr>
                 <w:rStyle w:val="Collegamentoipertestuale"/>
@@ -409,7 +413,7 @@
                 <w:noProof/>
                 <w:webHidden/>
               </w:rPr>
-              <w:instrText xml:space="preserve"> PAGEREF _Toc172986046 \h </w:instrText>
+              <w:instrText xml:space="preserve"> PAGEREF _Toc173135893 \h </w:instrText>
             </w:r>
             <w:r>
               <w:rPr>
@@ -453,7 +457,7 @@
               <w:lang w:eastAsia="it-IT"/>
             </w:rPr>
           </w:pPr>
-          <w:hyperlink w:anchor="_Toc172986047" w:history="1">
+          <w:hyperlink w:anchor="_Toc173135894" w:history="1">
             <w:r>
               <w:rPr>
                 <w:rStyle w:val="Collegamentoipertestuale"/>
@@ -495,7 +499,7 @@
                 <w:noProof/>
                 <w:webHidden/>
               </w:rPr>
-              <w:instrText xml:space="preserve"> PAGEREF _Toc172986047 \h </w:instrText>
+              <w:instrText xml:space="preserve"> PAGEREF _Toc173135894 \h </w:instrText>
             </w:r>
             <w:r>
               <w:rPr>
@@ -516,6 +520,216 @@
                 <w:webHidden/>
               </w:rPr>
               <w:t>4</w:t>
+            </w:r>
+            <w:r>
+              <w:rPr>
+                <w:noProof/>
+                <w:webHidden/>
+              </w:rPr>
+              <w:fldChar w:fldCharType="end"/>
+            </w:r>
+          </w:hyperlink>
+        </w:p>
+        <w:p>
+          <w:pPr>
+            <w:pStyle w:val="Sommario3"/>
+            <w:tabs>
+              <w:tab w:val="right" w:leader="dot" w:pos="9628"/>
+            </w:tabs>
+            <w:rPr>
+              <w:rFonts w:eastAsiaTheme="minorEastAsia"/>
+              <w:noProof/>
+              <w:lang w:eastAsia="it-IT"/>
+            </w:rPr>
+          </w:pPr>
+          <w:hyperlink w:anchor="_Toc173135895" w:history="1">
+            <w:r>
+              <w:rPr>
+                <w:rStyle w:val="Collegamentoipertestuale"/>
+                <w:noProof/>
+              </w:rPr>
+              <w:t>CHECK:</w:t>
+            </w:r>
+            <w:r>
+              <w:rPr>
+                <w:noProof/>
+                <w:webHidden/>
+              </w:rPr>
+              <w:tab/>
+            </w:r>
+            <w:r>
+              <w:rPr>
+                <w:noProof/>
+                <w:webHidden/>
+              </w:rPr>
+              <w:fldChar w:fldCharType="begin"/>
+            </w:r>
+            <w:r>
+              <w:rPr>
+                <w:noProof/>
+                <w:webHidden/>
+              </w:rPr>
+              <w:instrText xml:space="preserve"> PAGEREF _Toc173135895 \h </w:instrText>
+            </w:r>
+            <w:r>
+              <w:rPr>
+                <w:noProof/>
+                <w:webHidden/>
+              </w:rPr>
+            </w:r>
+            <w:r>
+              <w:rPr>
+                <w:noProof/>
+                <w:webHidden/>
+              </w:rPr>
+              <w:fldChar w:fldCharType="separate"/>
+            </w:r>
+            <w:r>
+              <w:rPr>
+                <w:noProof/>
+                <w:webHidden/>
+              </w:rPr>
+              <w:t>4</w:t>
+            </w:r>
+            <w:r>
+              <w:rPr>
+                <w:noProof/>
+                <w:webHidden/>
+              </w:rPr>
+              <w:fldChar w:fldCharType="end"/>
+            </w:r>
+          </w:hyperlink>
+        </w:p>
+        <w:p>
+          <w:pPr>
+            <w:pStyle w:val="Sommario3"/>
+            <w:tabs>
+              <w:tab w:val="right" w:leader="dot" w:pos="9628"/>
+            </w:tabs>
+            <w:rPr>
+              <w:rFonts w:eastAsiaTheme="minorEastAsia"/>
+              <w:noProof/>
+              <w:lang w:eastAsia="it-IT"/>
+            </w:rPr>
+          </w:pPr>
+          <w:hyperlink w:anchor="_Toc173135896" w:history="1">
+            <w:r>
+              <w:rPr>
+                <w:rStyle w:val="Collegamentoipertestuale"/>
+                <w:noProof/>
+              </w:rPr>
+              <w:t>TRIGGER:</w:t>
+            </w:r>
+            <w:r>
+              <w:rPr>
+                <w:noProof/>
+                <w:webHidden/>
+              </w:rPr>
+              <w:tab/>
+            </w:r>
+            <w:r>
+              <w:rPr>
+                <w:noProof/>
+                <w:webHidden/>
+              </w:rPr>
+              <w:fldChar w:fldCharType="begin"/>
+            </w:r>
+            <w:r>
+              <w:rPr>
+                <w:noProof/>
+                <w:webHidden/>
+              </w:rPr>
+              <w:instrText xml:space="preserve"> PAGEREF _Toc173135896 \h </w:instrText>
+            </w:r>
+            <w:r>
+              <w:rPr>
+                <w:noProof/>
+                <w:webHidden/>
+              </w:rPr>
+            </w:r>
+            <w:r>
+              <w:rPr>
+                <w:noProof/>
+                <w:webHidden/>
+              </w:rPr>
+              <w:fldChar w:fldCharType="separate"/>
+            </w:r>
+            <w:r>
+              <w:rPr>
+                <w:noProof/>
+                <w:webHidden/>
+              </w:rPr>
+              <w:t>4</w:t>
+            </w:r>
+            <w:r>
+              <w:rPr>
+                <w:noProof/>
+                <w:webHidden/>
+              </w:rPr>
+              <w:fldChar w:fldCharType="end"/>
+            </w:r>
+          </w:hyperlink>
+        </w:p>
+        <w:p>
+          <w:pPr>
+            <w:pStyle w:val="Sommario3"/>
+            <w:tabs>
+              <w:tab w:val="right" w:leader="dot" w:pos="9628"/>
+            </w:tabs>
+            <w:rPr>
+              <w:rFonts w:eastAsiaTheme="minorEastAsia"/>
+              <w:noProof/>
+              <w:lang w:eastAsia="it-IT"/>
+            </w:rPr>
+          </w:pPr>
+          <w:hyperlink w:anchor="_Toc173135897" w:history="1">
+            <w:r>
+              <w:rPr>
+                <w:rStyle w:val="Collegamentoipertestuale"/>
+                <w:noProof/>
+              </w:rPr>
+              <w:t>SQLAlchemy:</w:t>
+            </w:r>
+            <w:r>
+              <w:rPr>
+                <w:noProof/>
+                <w:webHidden/>
+              </w:rPr>
+              <w:tab/>
+            </w:r>
+            <w:r>
+              <w:rPr>
+                <w:noProof/>
+                <w:webHidden/>
+              </w:rPr>
+              <w:fldChar w:fldCharType="begin"/>
+            </w:r>
+            <w:r>
+              <w:rPr>
+                <w:noProof/>
+                <w:webHidden/>
+              </w:rPr>
+              <w:instrText xml:space="preserve"> PAGEREF _Toc173135897 \h </w:instrText>
+            </w:r>
+            <w:r>
+              <w:rPr>
+                <w:noProof/>
+                <w:webHidden/>
+              </w:rPr>
+            </w:r>
+            <w:r>
+              <w:rPr>
+                <w:noProof/>
+                <w:webHidden/>
+              </w:rPr>
+              <w:fldChar w:fldCharType="separate"/>
+            </w:r>
+            <w:r>
+              <w:rPr>
+                <w:noProof/>
+                <w:webHidden/>
+              </w:rPr>
+              <w:t>5</w:t>
             </w:r>
             <w:r>
               <w:rPr>
@@ -539,7 +753,7 @@
               <w:lang w:eastAsia="it-IT"/>
             </w:rPr>
           </w:pPr>
-          <w:hyperlink w:anchor="_Toc172986048" w:history="1">
+          <w:hyperlink w:anchor="_Toc173135898" w:history="1">
             <w:r>
               <w:rPr>
                 <w:rStyle w:val="Collegamentoipertestuale"/>
@@ -581,7 +795,7 @@
                 <w:noProof/>
                 <w:webHidden/>
               </w:rPr>
-              <w:instrText xml:space="preserve"> PAGEREF _Toc172986048 \h </w:instrText>
+              <w:instrText xml:space="preserve"> PAGEREF _Toc173135898 \h </w:instrText>
             </w:r>
             <w:r>
               <w:rPr>
@@ -601,7 +815,7 @@
                 <w:noProof/>
                 <w:webHidden/>
               </w:rPr>
-              <w:t>4</w:t>
+              <w:t>5</w:t>
             </w:r>
             <w:r>
               <w:rPr>
@@ -625,7 +839,7 @@
               <w:lang w:eastAsia="it-IT"/>
             </w:rPr>
           </w:pPr>
-          <w:hyperlink w:anchor="_Toc172986049" w:history="1">
+          <w:hyperlink w:anchor="_Toc173135899" w:history="1">
             <w:r>
               <w:rPr>
                 <w:rStyle w:val="Collegamentoipertestuale"/>
@@ -667,7 +881,7 @@
                 <w:noProof/>
                 <w:webHidden/>
               </w:rPr>
-              <w:instrText xml:space="preserve"> PAGEREF _Toc172986049 \h </w:instrText>
+              <w:instrText xml:space="preserve"> PAGEREF _Toc173135899 \h </w:instrText>
             </w:r>
             <w:r>
               <w:rPr>
@@ -687,7 +901,7 @@
                 <w:noProof/>
                 <w:webHidden/>
               </w:rPr>
-              <w:t>4</w:t>
+              <w:t>6</w:t>
             </w:r>
             <w:r>
               <w:rPr>
@@ -711,7 +925,7 @@
               <w:lang w:eastAsia="it-IT"/>
             </w:rPr>
           </w:pPr>
-          <w:hyperlink w:anchor="_Toc172986050" w:history="1">
+          <w:hyperlink w:anchor="_Toc173135900" w:history="1">
             <w:r>
               <w:rPr>
                 <w:rStyle w:val="Collegamentoipertestuale"/>
@@ -753,7 +967,7 @@
                 <w:noProof/>
                 <w:webHidden/>
               </w:rPr>
-              <w:instrText xml:space="preserve"> PAGEREF _Toc172986050 \h </w:instrText>
+              <w:instrText xml:space="preserve"> PAGEREF _Toc173135900 \h </w:instrText>
             </w:r>
             <w:r>
               <w:rPr>
@@ -773,7 +987,7 @@
                 <w:noProof/>
                 <w:webHidden/>
               </w:rPr>
-              <w:t>4</w:t>
+              <w:t>6</w:t>
             </w:r>
             <w:r>
               <w:rPr>
@@ -803,7 +1017,7 @@
           <w:numId w:val="1"/>
         </w:numPr>
       </w:pPr>
-      <w:bookmarkStart w:id="0" w:name="_Toc172986042"/>
+      <w:bookmarkStart w:id="0" w:name="_Toc173135889"/>
       <w:r>
         <w:t>INTRODUZIONE</w:t>
       </w:r>
@@ -818,7 +1032,7 @@
           <w:numId w:val="1"/>
         </w:numPr>
       </w:pPr>
-      <w:bookmarkStart w:id="1" w:name="_Toc172986043"/>
+      <w:bookmarkStart w:id="1" w:name="_Toc173135890"/>
       <w:r>
         <w:t>FUNZIONALITÀ PRINCIPALI</w:t>
       </w:r>
@@ -833,7 +1047,7 @@
           <w:numId w:val="1"/>
         </w:numPr>
       </w:pPr>
-      <w:bookmarkStart w:id="2" w:name="_Toc172986044"/>
+      <w:bookmarkStart w:id="2" w:name="_Toc173135891"/>
       <w:r>
         <w:t>PROGETTAZIONE CONCETTUALE E LOGICA</w:t>
       </w:r>
@@ -844,7 +1058,7 @@
         <w:pStyle w:val="Titolo3"/>
         <w:ind w:firstLine="708"/>
       </w:pPr>
-      <w:bookmarkStart w:id="3" w:name="_Toc172986045"/>
+      <w:bookmarkStart w:id="3" w:name="_Toc173135892"/>
       <w:r>
         <w:t>Progettazione concettuale:</w:t>
       </w:r>
@@ -862,6 +1076,10 @@
         <w:ind w:left="708"/>
       </w:pPr>
       <w:r>
+        <w:rPr>
+          <w:noProof/>
+          <w:lang w:eastAsia="it-IT"/>
+        </w:rPr>
         <w:drawing>
           <wp:anchor distT="0" distB="0" distL="114300" distR="114300" simplePos="0" relativeHeight="251665408" behindDoc="0" locked="0" layoutInCell="1" allowOverlap="1" wp14:anchorId="5AB3F82C" wp14:editId="4544A506">
             <wp:simplePos x="0" y="0"/>
@@ -985,7 +1203,6 @@
         <w:ind w:left="708"/>
       </w:pPr>
       <w:r>
-        <w:lastRenderedPageBreak/>
         <w:t>La progettazione concettuale è stata suddivisa in tre classi:</w:t>
       </w:r>
     </w:p>
@@ -1212,9 +1429,8 @@
       <w:pPr>
         <w:pStyle w:val="Titolo3"/>
       </w:pPr>
-      <w:bookmarkStart w:id="4" w:name="_Toc172986046"/>
-      <w:r>
-        <w:lastRenderedPageBreak/>
+      <w:bookmarkStart w:id="4" w:name="_Toc173135893"/>
+      <w:r>
         <w:t>Progettazione logica:</w:t>
       </w:r>
       <w:bookmarkEnd w:id="4"/>
@@ -1358,8 +1574,9 @@
           <w:numId w:val="1"/>
         </w:numPr>
       </w:pPr>
-      <w:bookmarkStart w:id="5" w:name="_Toc172986047"/>
-      <w:r>
+      <w:bookmarkStart w:id="5" w:name="_Toc173135894"/>
+      <w:r>
+        <w:lastRenderedPageBreak/>
         <w:t>QUERY PRINCIPALI</w:t>
       </w:r>
       <w:bookmarkEnd w:id="5"/>
@@ -1418,10 +1635,11 @@
         <w:pStyle w:val="Titolo3"/>
         <w:ind w:firstLine="708"/>
       </w:pPr>
-      <w:r>
-        <w:lastRenderedPageBreak/>
+      <w:bookmarkStart w:id="6" w:name="_Toc173135895"/>
+      <w:r>
         <w:t>CHECK:</w:t>
       </w:r>
+      <w:bookmarkEnd w:id="6"/>
     </w:p>
     <w:p>
       <w:pPr>
@@ -1455,6 +1673,9 @@
         <w:tab/>
       </w:r>
       <w:r>
+        <w:rPr>
+          <w:noProof/>
+        </w:rPr>
         <w:drawing>
           <wp:inline distT="0" distB="0" distL="0" distR="0" wp14:anchorId="0F7A6A55" wp14:editId="56B0A63B">
             <wp:extent cx="3361764" cy="769720"/>
@@ -1530,6 +1751,10 @@
         <w:t xml:space="preserve">     </w:t>
       </w:r>
       <w:r>
+        <w:rPr>
+          <w:noProof/>
+          <w:lang w:eastAsia="it-IT"/>
+        </w:rPr>
         <w:drawing>
           <wp:inline distT="0" distB="0" distL="0" distR="0" wp14:anchorId="4AA888D9" wp14:editId="3E96D31C">
             <wp:extent cx="3370730" cy="669000"/>
@@ -1600,6 +1825,10 @@
         <w:t xml:space="preserve">    </w:t>
       </w:r>
       <w:r>
+        <w:rPr>
+          <w:noProof/>
+          <w:lang w:eastAsia="it-IT"/>
+        </w:rPr>
         <w:drawing>
           <wp:inline distT="0" distB="0" distL="0" distR="0" wp14:anchorId="435EE455" wp14:editId="4DEC1944">
             <wp:extent cx="3437965" cy="597907"/>
@@ -1670,6 +1899,10 @@
         <w:t xml:space="preserve">   </w:t>
       </w:r>
       <w:r>
+        <w:rPr>
+          <w:noProof/>
+          <w:lang w:eastAsia="it-IT"/>
+        </w:rPr>
         <w:drawing>
           <wp:inline distT="0" distB="0" distL="0" distR="0" wp14:anchorId="100A87B6" wp14:editId="00FDD0D5">
             <wp:extent cx="3496236" cy="826977"/>
@@ -1714,8 +1947,12 @@
       </w:pPr>
       <w:r>
         <w:tab/>
+      </w:r>
+      <w:bookmarkStart w:id="7" w:name="_Toc173135896"/>
+      <w:r>
         <w:t>TRIGGER:</w:t>
       </w:r>
+      <w:bookmarkEnd w:id="7"/>
     </w:p>
     <w:p>
       <w:r>
@@ -1740,6 +1977,10 @@
         <w:ind w:left="1416"/>
       </w:pPr>
       <w:r>
+        <w:rPr>
+          <w:noProof/>
+          <w:lang w:eastAsia="it-IT"/>
+        </w:rPr>
         <w:drawing>
           <wp:anchor distT="0" distB="0" distL="114300" distR="114300" simplePos="0" relativeHeight="251660288" behindDoc="1" locked="0" layoutInCell="1" allowOverlap="1" wp14:anchorId="3C466C68" wp14:editId="74B99630">
             <wp:simplePos x="0" y="0"/>
@@ -1802,6 +2043,7 @@
         <w:pStyle w:val="Titolo3"/>
       </w:pPr>
       <w:r>
+        <w:lastRenderedPageBreak/>
         <w:tab/>
       </w:r>
     </w:p>
@@ -1829,24 +2071,22 @@
         <w:ind w:firstLine="708"/>
       </w:pPr>
     </w:p>
-    <w:p>
-      <w:bookmarkStart w:id="6" w:name="_GoBack"/>
-      <w:bookmarkEnd w:id="6"/>
-    </w:p>
+    <w:p/>
     <w:p>
       <w:pPr>
         <w:pStyle w:val="Titolo3"/>
         <w:ind w:firstLine="708"/>
       </w:pPr>
+      <w:bookmarkStart w:id="8" w:name="_Toc173135897"/>
       <w:proofErr w:type="spellStart"/>
       <w:r>
-        <w:lastRenderedPageBreak/>
         <w:t>SQLAlchemy</w:t>
       </w:r>
       <w:proofErr w:type="spellEnd"/>
       <w:r>
         <w:t>:</w:t>
       </w:r>
+      <w:bookmarkEnd w:id="8"/>
     </w:p>
     <w:p/>
     <w:p>
@@ -1880,6 +2120,10 @@
         <w:ind w:left="2484"/>
       </w:pPr>
       <w:r>
+        <w:rPr>
+          <w:noProof/>
+          <w:lang w:eastAsia="it-IT"/>
+        </w:rPr>
         <w:drawing>
           <wp:anchor distT="0" distB="0" distL="114300" distR="114300" simplePos="0" relativeHeight="251661312" behindDoc="0" locked="0" layoutInCell="1" allowOverlap="1" wp14:anchorId="4E15AAC6" wp14:editId="304549B8">
             <wp:simplePos x="0" y="0"/>
@@ -1958,6 +2202,10 @@
         <w:ind w:left="2484"/>
       </w:pPr>
       <w:r>
+        <w:rPr>
+          <w:noProof/>
+          <w:lang w:eastAsia="it-IT"/>
+        </w:rPr>
         <w:drawing>
           <wp:anchor distT="0" distB="0" distL="114300" distR="114300" simplePos="0" relativeHeight="251662336" behindDoc="0" locked="0" layoutInCell="1" allowOverlap="1" wp14:anchorId="53E196CC" wp14:editId="1062E708">
             <wp:simplePos x="0" y="0"/>
@@ -2042,6 +2290,10 @@
         </w:numPr>
       </w:pPr>
       <w:r>
+        <w:rPr>
+          <w:noProof/>
+          <w:lang w:eastAsia="it-IT"/>
+        </w:rPr>
         <w:drawing>
           <wp:anchor distT="0" distB="0" distL="114300" distR="114300" simplePos="0" relativeHeight="251663360" behindDoc="0" locked="0" layoutInCell="1" allowOverlap="1" wp14:anchorId="24740FD3" wp14:editId="138FD52A">
             <wp:simplePos x="0" y="0"/>
@@ -2135,6 +2387,10 @@
         </w:numPr>
       </w:pPr>
       <w:r>
+        <w:rPr>
+          <w:noProof/>
+          <w:lang w:eastAsia="it-IT"/>
+        </w:rPr>
         <w:drawing>
           <wp:anchor distT="0" distB="0" distL="114300" distR="114300" simplePos="0" relativeHeight="251664384" behindDoc="0" locked="0" layoutInCell="1" allowOverlap="1" wp14:anchorId="3E6FA6F1" wp14:editId="5C643774">
             <wp:simplePos x="0" y="0"/>
@@ -2241,11 +2497,11 @@
           <w:numId w:val="1"/>
         </w:numPr>
       </w:pPr>
-      <w:bookmarkStart w:id="7" w:name="_Toc172986048"/>
+      <w:bookmarkStart w:id="9" w:name="_Toc173135898"/>
       <w:r>
         <w:t>PRINCIPALI SCELTE PROGETTUALI</w:t>
       </w:r>
-      <w:bookmarkEnd w:id="7"/>
+      <w:bookmarkEnd w:id="9"/>
     </w:p>
     <w:p/>
     <w:p>
@@ -2261,7 +2517,10 @@
       </w:r>
       <w:proofErr w:type="spellEnd"/>
       <w:r>
-        <w:t xml:space="preserve"> con una variabile di tipo </w:t>
+        <w:t xml:space="preserve"> con un</w:t>
+      </w:r>
+      <w:r>
+        <w:t xml:space="preserve">a variabile di tipo </w:t>
       </w:r>
       <w:proofErr w:type="spellStart"/>
       <w:r>
@@ -2273,7 +2532,12 @@
       </w:r>
       <w:proofErr w:type="spellStart"/>
       <w:r>
-        <w:t>is_venfitore</w:t>
+        <w:t>is_vend</w:t>
+      </w:r>
+      <w:bookmarkStart w:id="10" w:name="_GoBack"/>
+      <w:bookmarkEnd w:id="10"/>
+      <w:r>
+        <w:t>itore</w:t>
       </w:r>
       <w:proofErr w:type="spellEnd"/>
       <w:r>
@@ -2332,11 +2596,11 @@
           <w:numId w:val="1"/>
         </w:numPr>
       </w:pPr>
-      <w:bookmarkStart w:id="8" w:name="_Toc172986049"/>
+      <w:bookmarkStart w:id="11" w:name="_Toc173135899"/>
       <w:r>
         <w:t>ULTERIORI INFORMAZIONI</w:t>
       </w:r>
-      <w:bookmarkEnd w:id="8"/>
+      <w:bookmarkEnd w:id="11"/>
     </w:p>
     <w:p>
       <w:pPr>
@@ -2395,7 +2659,6 @@
       </w:pPr>
       <w:proofErr w:type="spellStart"/>
       <w:r>
-        <w:lastRenderedPageBreak/>
         <w:t>Flask</w:t>
       </w:r>
       <w:proofErr w:type="spellEnd"/>
@@ -2504,11 +2767,11 @@
           <w:numId w:val="1"/>
         </w:numPr>
       </w:pPr>
-      <w:bookmarkStart w:id="9" w:name="_Toc172986050"/>
+      <w:bookmarkStart w:id="12" w:name="_Toc173135900"/>
       <w:r>
         <w:t>CONTRIBUTO DEL PROGETTO</w:t>
       </w:r>
-      <w:bookmarkEnd w:id="9"/>
+      <w:bookmarkEnd w:id="12"/>
     </w:p>
     <w:p>
       <w:pPr>
@@ -4294,7 +4557,7 @@
 </file>
 
 <file path=customXml/itemProps1.xml><?xml version="1.0" encoding="utf-8"?>
-<ds:datastoreItem xmlns:ds="http://schemas.openxmlformats.org/officeDocument/2006/customXml" ds:itemID="{69AC5E0D-3242-4A5A-BFD0-DC45407E644E}">
+<ds:datastoreItem xmlns:ds="http://schemas.openxmlformats.org/officeDocument/2006/customXml" ds:itemID="{A2EE4286-06C8-4B4E-9DA5-280F3D1EC534}">
   <ds:schemaRefs>
     <ds:schemaRef ds:uri="http://schemas.openxmlformats.org/officeDocument/2006/bibliography"/>
   </ds:schemaRefs>

</xml_diff>

<commit_message>
modifica per aggiornare il prezzo
</commit_message>
<xml_diff>
--- a/2023-2024/Basi di Dati/Progetto/RELAZIONE PROGETTO E.docx
+++ b/2023-2024/Basi di Dati/Progetto/RELAZIONE PROGETTO E.docx
@@ -6,6 +6,8 @@
       <w:pPr>
         <w:pStyle w:val="Titolo"/>
       </w:pPr>
+      <w:bookmarkStart w:id="0" w:name="_GoBack"/>
+      <w:bookmarkEnd w:id="0"/>
       <w:r>
         <w:t>RELAZIONE PROGETTO E-COMMERCE</w:t>
       </w:r>
@@ -36,8 +38,6 @@
           <w:r>
             <w:t>Sommario</w:t>
           </w:r>
-          <w:bookmarkStart w:id="0" w:name="_GoBack"/>
-          <w:bookmarkEnd w:id="0"/>
         </w:p>
         <w:p>
           <w:pPr>
@@ -295,7 +295,7 @@
                 <w:noProof/>
                 <w:webHidden/>
               </w:rPr>
-              <w:t>1</w:t>
+              <w:t>3</w:t>
             </w:r>
             <w:r>
               <w:rPr>
@@ -365,7 +365,7 @@
                 <w:noProof/>
                 <w:webHidden/>
               </w:rPr>
-              <w:t>1</w:t>
+              <w:t>3</w:t>
             </w:r>
             <w:r>
               <w:rPr>
@@ -435,7 +435,7 @@
                 <w:noProof/>
                 <w:webHidden/>
               </w:rPr>
-              <w:t>3</w:t>
+              <w:t>5</w:t>
             </w:r>
             <w:r>
               <w:rPr>
@@ -521,7 +521,7 @@
                 <w:noProof/>
                 <w:webHidden/>
               </w:rPr>
-              <w:t>4</w:t>
+              <w:t>5</w:t>
             </w:r>
             <w:r>
               <w:rPr>
@@ -591,7 +591,7 @@
                 <w:noProof/>
                 <w:webHidden/>
               </w:rPr>
-              <w:t>4</w:t>
+              <w:t>6</w:t>
             </w:r>
             <w:r>
               <w:rPr>
@@ -677,7 +677,7 @@
                 <w:noProof/>
                 <w:webHidden/>
               </w:rPr>
-              <w:t>5</w:t>
+              <w:t>7</w:t>
             </w:r>
             <w:r>
               <w:rPr>
@@ -747,7 +747,7 @@
                 <w:noProof/>
                 <w:webHidden/>
               </w:rPr>
-              <w:t>5</w:t>
+              <w:t>7</w:t>
             </w:r>
             <w:r>
               <w:rPr>
@@ -817,7 +817,7 @@
                 <w:noProof/>
                 <w:webHidden/>
               </w:rPr>
-              <w:t>6</w:t>
+              <w:t>8</w:t>
             </w:r>
             <w:r>
               <w:rPr>
@@ -887,7 +887,7 @@
                 <w:noProof/>
                 <w:webHidden/>
               </w:rPr>
-              <w:t>6</w:t>
+              <w:t>8</w:t>
             </w:r>
             <w:r>
               <w:rPr>
@@ -973,7 +973,7 @@
                 <w:noProof/>
                 <w:webHidden/>
               </w:rPr>
-              <w:t>6</w:t>
+              <w:t>8</w:t>
             </w:r>
             <w:r>
               <w:rPr>
@@ -1059,7 +1059,7 @@
                 <w:noProof/>
                 <w:webHidden/>
               </w:rPr>
-              <w:t>7</w:t>
+              <w:t>9</w:t>
             </w:r>
             <w:r>
               <w:rPr>
@@ -1167,6 +1167,10 @@
         </w:numPr>
       </w:pPr>
       <w:r>
+        <w:rPr>
+          <w:noProof/>
+          <w:lang w:eastAsia="it-IT"/>
+        </w:rPr>
         <w:drawing>
           <wp:anchor distT="0" distB="0" distL="114300" distR="114300" simplePos="0" relativeHeight="251673600" behindDoc="0" locked="0" layoutInCell="1" allowOverlap="1" wp14:anchorId="20246B0D" wp14:editId="302BA3B2">
             <wp:simplePos x="0" y="0"/>
@@ -1233,6 +1237,10 @@
         <w:ind w:left="1068"/>
       </w:pPr>
       <w:r>
+        <w:rPr>
+          <w:noProof/>
+          <w:lang w:eastAsia="it-IT"/>
+        </w:rPr>
         <w:drawing>
           <wp:anchor distT="0" distB="0" distL="114300" distR="114300" simplePos="0" relativeHeight="251674624" behindDoc="0" locked="0" layoutInCell="1" allowOverlap="1" wp14:anchorId="2FC387EC" wp14:editId="7B422439">
             <wp:simplePos x="0" y="0"/>
@@ -1290,6 +1298,10 @@
         </w:drawing>
       </w:r>
       <w:r>
+        <w:rPr>
+          <w:noProof/>
+          <w:lang w:eastAsia="it-IT"/>
+        </w:rPr>
         <w:drawing>
           <wp:anchor distT="0" distB="0" distL="114300" distR="114300" simplePos="0" relativeHeight="251672576" behindDoc="0" locked="0" layoutInCell="1" allowOverlap="1" wp14:anchorId="53639334" wp14:editId="2E1326C8">
             <wp:simplePos x="0" y="0"/>
@@ -1416,6 +1428,10 @@
         <w:ind w:left="1416"/>
       </w:pPr>
       <w:r>
+        <w:rPr>
+          <w:noProof/>
+          <w:lang w:eastAsia="it-IT"/>
+        </w:rPr>
         <w:drawing>
           <wp:anchor distT="0" distB="0" distL="114300" distR="114300" simplePos="0" relativeHeight="251675648" behindDoc="0" locked="0" layoutInCell="1" allowOverlap="1" wp14:anchorId="1FDA7E83" wp14:editId="1C341A05">
             <wp:simplePos x="0" y="0"/>
@@ -1473,6 +1489,10 @@
         </w:drawing>
       </w:r>
       <w:r>
+        <w:rPr>
+          <w:noProof/>
+          <w:lang w:eastAsia="it-IT"/>
+        </w:rPr>
         <w:drawing>
           <wp:inline distT="0" distB="0" distL="0" distR="0" wp14:anchorId="5ED977B1" wp14:editId="57D19F56">
             <wp:extent cx="1770530" cy="2477510"/>
@@ -1525,6 +1545,10 @@
         <w:ind w:left="1416"/>
       </w:pPr>
       <w:r>
+        <w:rPr>
+          <w:noProof/>
+          <w:lang w:eastAsia="it-IT"/>
+        </w:rPr>
         <w:drawing>
           <wp:inline distT="0" distB="0" distL="0" distR="0" wp14:anchorId="0C73A025" wp14:editId="4AD36F7A">
             <wp:extent cx="3836895" cy="854252"/>
@@ -1601,6 +1625,10 @@
         <w:ind w:left="1416"/>
       </w:pPr>
       <w:r>
+        <w:rPr>
+          <w:noProof/>
+          <w:lang w:eastAsia="it-IT"/>
+        </w:rPr>
         <w:drawing>
           <wp:inline distT="0" distB="0" distL="0" distR="0" wp14:anchorId="0BC12AE4" wp14:editId="1C99C3B1">
             <wp:extent cx="4448796" cy="552527"/>
@@ -1653,6 +1681,10 @@
         <w:ind w:left="1416"/>
       </w:pPr>
       <w:r>
+        <w:rPr>
+          <w:noProof/>
+          <w:lang w:eastAsia="it-IT"/>
+        </w:rPr>
         <w:drawing>
           <wp:inline distT="0" distB="0" distL="0" distR="0" wp14:anchorId="614CCDDA" wp14:editId="4CBE3A1B">
             <wp:extent cx="4450977" cy="685642"/>
@@ -1705,6 +1737,10 @@
         <w:ind w:left="1416"/>
       </w:pPr>
       <w:r>
+        <w:rPr>
+          <w:noProof/>
+          <w:lang w:eastAsia="it-IT"/>
+        </w:rPr>
         <w:drawing>
           <wp:inline distT="0" distB="0" distL="0" distR="0" wp14:anchorId="21FA487D" wp14:editId="4D72CA4F">
             <wp:extent cx="1324160" cy="1047896"/>
@@ -1757,6 +1793,10 @@
         <w:ind w:left="1416"/>
       </w:pPr>
       <w:r>
+        <w:rPr>
+          <w:noProof/>
+          <w:lang w:eastAsia="it-IT"/>
+        </w:rPr>
         <w:drawing>
           <wp:inline distT="0" distB="0" distL="0" distR="0" wp14:anchorId="11D369D3" wp14:editId="79D6F347">
             <wp:extent cx="5356412" cy="1195148"/>
@@ -1810,6 +1850,10 @@
         <w:ind w:left="1416"/>
       </w:pPr>
       <w:r>
+        <w:rPr>
+          <w:noProof/>
+          <w:lang w:eastAsia="it-IT"/>
+        </w:rPr>
         <w:drawing>
           <wp:inline distT="0" distB="0" distL="0" distR="0" wp14:anchorId="12C0499B" wp14:editId="73978B6E">
             <wp:extent cx="3343742" cy="438211"/>
@@ -1871,6 +1915,10 @@
         <w:ind w:left="1068"/>
       </w:pPr>
       <w:r>
+        <w:rPr>
+          <w:noProof/>
+          <w:lang w:eastAsia="it-IT"/>
+        </w:rPr>
         <w:drawing>
           <wp:inline distT="0" distB="0" distL="0" distR="0" wp14:anchorId="49270B0F" wp14:editId="27160947">
             <wp:extent cx="1277881" cy="2147047"/>
@@ -1908,6 +1956,10 @@
         </w:drawing>
       </w:r>
       <w:r>
+        <w:rPr>
+          <w:noProof/>
+          <w:lang w:eastAsia="it-IT"/>
+        </w:rPr>
         <w:drawing>
           <wp:inline distT="0" distB="0" distL="0" distR="0" wp14:anchorId="7E747513" wp14:editId="57A31D85">
             <wp:extent cx="1310202" cy="2142565"/>
@@ -5945,7 +5997,7 @@
 </file>
 
 <file path=customXml/itemProps1.xml><?xml version="1.0" encoding="utf-8"?>
-<ds:datastoreItem xmlns:ds="http://schemas.openxmlformats.org/officeDocument/2006/customXml" ds:itemID="{D4040087-5370-4D89-BBF4-9FC3282F76CC}">
+<ds:datastoreItem xmlns:ds="http://schemas.openxmlformats.org/officeDocument/2006/customXml" ds:itemID="{F1FD9B29-B5F8-47DA-A4FF-B14082C3E627}">
   <ds:schemaRefs>
     <ds:schemaRef ds:uri="http://schemas.openxmlformats.org/officeDocument/2006/bibliography"/>
   </ds:schemaRefs>

</xml_diff>

<commit_message>
rielaborazione parte della relazione
</commit_message>
<xml_diff>
--- a/2023-2024/Basi di Dati/Progetto/RELAZIONE PROGETTO E.docx
+++ b/2023-2024/Basi di Dati/Progetto/RELAZIONE PROGETTO E.docx
@@ -519,7 +519,7 @@
                 <w:noProof/>
                 <w:webHidden/>
               </w:rPr>
-              <w:t>5</w:t>
+              <w:t>6</w:t>
             </w:r>
             <w:r>
               <w:rPr>
@@ -1079,6 +1079,19 @@
         </w:p>
       </w:sdtContent>
     </w:sdt>
+    <w:p/>
+    <w:p/>
+    <w:p/>
+    <w:p/>
+    <w:p/>
+    <w:p/>
+    <w:p/>
+    <w:p/>
+    <w:p/>
+    <w:p/>
+    <w:p/>
+    <w:p/>
+    <w:p/>
     <w:p>
       <w:pPr>
         <w:pStyle w:val="Titolo2"/>
@@ -1089,6 +1102,7 @@
       </w:pPr>
       <w:bookmarkStart w:id="0" w:name="_Toc173142939"/>
       <w:r>
+        <w:lastRenderedPageBreak/>
         <w:t>INTRODUZIONE</w:t>
       </w:r>
       <w:bookmarkEnd w:id="0"/>
@@ -1125,13 +1139,173 @@
     <w:p>
       <w:pPr>
         <w:ind w:left="720"/>
-      </w:pPr>
-      <w:r>
         <w:rPr>
           <w:rFonts w:cstheme="minorHAnsi"/>
         </w:rPr>
+      </w:pPr>
+      <w:r>
+        <w:rPr>
+          <w:rFonts w:cstheme="minorHAnsi"/>
+        </w:rPr>
         <w:t>Per il venditore ci sono le possibilità di aggiungere nuovi prodotti con descrizione, disponibilità e immagine. Inoltre si può modificare la disponibilità dei prodotti già presenti ed eventualmente rimuoverli.</w:t>
       </w:r>
+    </w:p>
+    <w:p>
+      <w:pPr>
+        <w:ind w:left="720"/>
+        <w:rPr>
+          <w:rFonts w:cstheme="minorHAnsi"/>
+        </w:rPr>
+      </w:pPr>
+    </w:p>
+    <w:p>
+      <w:pPr>
+        <w:ind w:left="720"/>
+        <w:rPr>
+          <w:rFonts w:cstheme="minorHAnsi"/>
+        </w:rPr>
+      </w:pPr>
+    </w:p>
+    <w:p>
+      <w:pPr>
+        <w:ind w:left="720"/>
+        <w:rPr>
+          <w:rFonts w:cstheme="minorHAnsi"/>
+        </w:rPr>
+      </w:pPr>
+    </w:p>
+    <w:p>
+      <w:pPr>
+        <w:ind w:left="720"/>
+        <w:rPr>
+          <w:rFonts w:cstheme="minorHAnsi"/>
+        </w:rPr>
+      </w:pPr>
+    </w:p>
+    <w:p>
+      <w:pPr>
+        <w:ind w:left="720"/>
+        <w:rPr>
+          <w:rFonts w:cstheme="minorHAnsi"/>
+        </w:rPr>
+      </w:pPr>
+    </w:p>
+    <w:p>
+      <w:pPr>
+        <w:ind w:left="720"/>
+        <w:rPr>
+          <w:rFonts w:cstheme="minorHAnsi"/>
+        </w:rPr>
+      </w:pPr>
+    </w:p>
+    <w:p>
+      <w:pPr>
+        <w:ind w:left="720"/>
+        <w:rPr>
+          <w:rFonts w:cstheme="minorHAnsi"/>
+        </w:rPr>
+      </w:pPr>
+    </w:p>
+    <w:p>
+      <w:pPr>
+        <w:ind w:left="720"/>
+        <w:rPr>
+          <w:rFonts w:cstheme="minorHAnsi"/>
+        </w:rPr>
+      </w:pPr>
+    </w:p>
+    <w:p>
+      <w:pPr>
+        <w:ind w:left="720"/>
+        <w:rPr>
+          <w:rFonts w:cstheme="minorHAnsi"/>
+        </w:rPr>
+      </w:pPr>
+    </w:p>
+    <w:p>
+      <w:pPr>
+        <w:ind w:left="720"/>
+        <w:rPr>
+          <w:rFonts w:cstheme="minorHAnsi"/>
+        </w:rPr>
+      </w:pPr>
+    </w:p>
+    <w:p>
+      <w:pPr>
+        <w:ind w:left="720"/>
+        <w:rPr>
+          <w:rFonts w:cstheme="minorHAnsi"/>
+        </w:rPr>
+      </w:pPr>
+    </w:p>
+    <w:p>
+      <w:pPr>
+        <w:ind w:left="720"/>
+        <w:rPr>
+          <w:rFonts w:cstheme="minorHAnsi"/>
+        </w:rPr>
+      </w:pPr>
+    </w:p>
+    <w:p>
+      <w:pPr>
+        <w:ind w:left="720"/>
+        <w:rPr>
+          <w:rFonts w:cstheme="minorHAnsi"/>
+        </w:rPr>
+      </w:pPr>
+    </w:p>
+    <w:p>
+      <w:pPr>
+        <w:ind w:left="720"/>
+        <w:rPr>
+          <w:rFonts w:cstheme="minorHAnsi"/>
+        </w:rPr>
+      </w:pPr>
+    </w:p>
+    <w:p>
+      <w:pPr>
+        <w:ind w:left="720"/>
+        <w:rPr>
+          <w:rFonts w:cstheme="minorHAnsi"/>
+        </w:rPr>
+      </w:pPr>
+    </w:p>
+    <w:p>
+      <w:pPr>
+        <w:ind w:left="720"/>
+        <w:rPr>
+          <w:rFonts w:cstheme="minorHAnsi"/>
+        </w:rPr>
+      </w:pPr>
+    </w:p>
+    <w:p>
+      <w:pPr>
+        <w:ind w:left="720"/>
+        <w:rPr>
+          <w:rFonts w:cstheme="minorHAnsi"/>
+        </w:rPr>
+      </w:pPr>
+    </w:p>
+    <w:p>
+      <w:pPr>
+        <w:ind w:left="720"/>
+        <w:rPr>
+          <w:rFonts w:cstheme="minorHAnsi"/>
+        </w:rPr>
+      </w:pPr>
+    </w:p>
+    <w:p>
+      <w:pPr>
+        <w:ind w:left="720"/>
+        <w:rPr>
+          <w:rFonts w:cstheme="minorHAnsi"/>
+        </w:rPr>
+      </w:pPr>
+    </w:p>
+    <w:p>
+      <w:pPr>
+        <w:ind w:left="720"/>
+      </w:pPr>
     </w:p>
     <w:p>
       <w:pPr>
@@ -1143,6 +1317,7 @@
       </w:pPr>
       <w:bookmarkStart w:id="1" w:name="_Toc173142940"/>
       <w:r>
+        <w:lastRenderedPageBreak/>
         <w:t>FUNZIONALITÀ PRINCIPALI</w:t>
       </w:r>
       <w:bookmarkEnd w:id="1"/>
@@ -1393,7 +1568,6 @@
         <w:rPr>
           <w:b/>
         </w:rPr>
-        <w:lastRenderedPageBreak/>
         <w:t>Possibilità per il venditore</w:t>
       </w:r>
       <w:r>
@@ -1548,8 +1722,11 @@
         <w:pStyle w:val="Paragrafoelenco"/>
         <w:ind w:left="1416"/>
       </w:pPr>
-      <w:bookmarkStart w:id="2" w:name="_GoBack"/>
-      <w:r>
+      <w:r>
+        <w:rPr>
+          <w:noProof/>
+          <w:lang w:eastAsia="it-IT"/>
+        </w:rPr>
         <w:drawing>
           <wp:inline distT="0" distB="0" distL="0" distR="0" wp14:anchorId="4440AFF8" wp14:editId="543FA42C">
             <wp:extent cx="4446815" cy="1462203"/>
@@ -1586,7 +1763,6 @@
           </wp:inline>
         </w:drawing>
       </w:r>
-      <w:bookmarkEnd w:id="2"/>
     </w:p>
     <w:p>
       <w:pPr>
@@ -1687,6 +1863,7 @@
           <w:noProof/>
           <w:lang w:eastAsia="it-IT"/>
         </w:rPr>
+        <w:lastRenderedPageBreak/>
         <w:drawing>
           <wp:inline distT="0" distB="0" distL="0" distR="0" wp14:anchorId="614CCDDA" wp14:editId="4CBE3A1B">
             <wp:extent cx="4450977" cy="685642"/>
@@ -1799,7 +1976,6 @@
           <w:noProof/>
           <w:lang w:eastAsia="it-IT"/>
         </w:rPr>
-        <w:lastRenderedPageBreak/>
         <w:drawing>
           <wp:inline distT="0" distB="0" distL="0" distR="0" wp14:anchorId="11D369D3" wp14:editId="79D6F347">
             <wp:extent cx="5356412" cy="1195148"/>
@@ -1842,6 +2018,12 @@
         <w:pStyle w:val="Paragrafoelenco"/>
         <w:ind w:left="1416"/>
       </w:pPr>
+    </w:p>
+    <w:p>
+      <w:pPr>
+        <w:pStyle w:val="Paragrafoelenco"/>
+        <w:ind w:left="1416"/>
+      </w:pPr>
       <w:r>
         <w:t xml:space="preserve">. Effettuare ricerche attraverso parole chiavi per trovare più velocemente i prodotti  desiderati </w:t>
       </w:r>
@@ -2006,6 +2188,7 @@
       </w:pPr>
     </w:p>
     <w:p/>
+    <w:p/>
     <w:p>
       <w:pPr>
         <w:pStyle w:val="Titolo2"/>
@@ -2014,22 +2197,23 @@
           <w:numId w:val="1"/>
         </w:numPr>
       </w:pPr>
-      <w:bookmarkStart w:id="3" w:name="_Toc173142941"/>
-      <w:r>
+      <w:bookmarkStart w:id="2" w:name="_Toc173142941"/>
+      <w:r>
+        <w:lastRenderedPageBreak/>
         <w:t>PROGETTAZIONE CONCETTUALE E LOGICA</w:t>
       </w:r>
-      <w:bookmarkEnd w:id="3"/>
+      <w:bookmarkEnd w:id="2"/>
     </w:p>
     <w:p>
       <w:pPr>
         <w:pStyle w:val="Titolo3"/>
         <w:ind w:firstLine="708"/>
       </w:pPr>
-      <w:bookmarkStart w:id="4" w:name="_Toc173142942"/>
+      <w:bookmarkStart w:id="3" w:name="_Toc173142942"/>
       <w:r>
         <w:t>Progettazione concettuale:</w:t>
       </w:r>
-      <w:bookmarkEnd w:id="4"/>
+      <w:bookmarkEnd w:id="3"/>
       <w:r>
         <w:rPr>
           <w:noProof/>
@@ -2259,7 +2443,13 @@
         <w:t>Vende</w:t>
       </w:r>
       <w:r>
-        <w:t xml:space="preserve">: collega Utenti a Prodotti con una molti-a-molti senza parzialità in quanto, secondo nostro ragionamento, una persona può vendere più prodotti se pensiamo al venditore, oppure più prodotti possono essere venduti a più acquirenti. </w:t>
+        <w:t>: collega Utenti a Prodotti con una molti-a-molti senza parzialità in quanto, secondo</w:t>
+      </w:r>
+      <w:r>
+        <w:t xml:space="preserve"> il</w:t>
+      </w:r>
+      <w:r>
+        <w:t xml:space="preserve"> nostro ragionamento, una persona può vendere più prodotti se pensiamo al venditore, oppure più prodotti possono essere venduti a più acquirenti. </w:t>
       </w:r>
     </w:p>
     <w:p>
@@ -2327,6 +2517,7 @@
           <w:rFonts w:cstheme="minorHAnsi"/>
           <w:b/>
         </w:rPr>
+        <w:lastRenderedPageBreak/>
         <w:t>Prodotti_ordini</w:t>
       </w:r>
       <w:proofErr w:type="spellEnd"/>
@@ -2396,11 +2587,12 @@
       <w:pPr>
         <w:pStyle w:val="Titolo3"/>
       </w:pPr>
-      <w:bookmarkStart w:id="5" w:name="_Toc173142943"/>
-      <w:r>
+      <w:bookmarkStart w:id="4" w:name="_Toc173142943"/>
+      <w:r>
+        <w:lastRenderedPageBreak/>
         <w:t>Progettazione logica:</w:t>
       </w:r>
-      <w:bookmarkEnd w:id="5"/>
+      <w:bookmarkEnd w:id="4"/>
     </w:p>
     <w:p>
       <w:pPr>
@@ -2486,21 +2678,21 @@
           <w:ilvl w:val="0"/>
           <w:numId w:val="3"/>
         </w:numPr>
+      </w:pPr>
+      <w:r>
         <w:rPr>
           <w:b/>
         </w:rPr>
-      </w:pPr>
+        <w:t>Vende:</w:t>
+      </w:r>
       <w:r>
         <w:rPr>
           <w:b/>
         </w:rPr>
-        <w:t>Vende:</w:t>
-      </w:r>
-      <w:r>
-        <w:rPr>
-          <w:b/>
-        </w:rPr>
         <w:t xml:space="preserve"> </w:t>
+      </w:r>
+      <w:r>
+        <w:t>si è generata dalla relazione molti-a-molti e contiene l’email dell’utente e l’id del prodotto.</w:t>
       </w:r>
     </w:p>
     <w:p>
@@ -2532,6 +2724,8 @@
         <w:t>si è formata a partire dall’attributo della relazione tra ordini e prodotti, contiene le due chiavi esterne che sono anche primarie oltre alla quantità dei prodotti e il totale.</w:t>
       </w:r>
     </w:p>
+    <w:p/>
+    <w:p/>
     <w:p/>
     <w:p/>
     <w:p>
@@ -2542,12 +2736,12 @@
           <w:numId w:val="1"/>
         </w:numPr>
       </w:pPr>
-      <w:bookmarkStart w:id="6" w:name="_Toc173142944"/>
+      <w:bookmarkStart w:id="5" w:name="_Toc173142944"/>
       <w:r>
         <w:lastRenderedPageBreak/>
         <w:t>QUERY PRINCIPALI</w:t>
       </w:r>
-      <w:bookmarkEnd w:id="6"/>
+      <w:bookmarkEnd w:id="5"/>
     </w:p>
     <w:p/>
     <w:p>
@@ -2600,7 +2794,7 @@
         <w:pStyle w:val="Titolo3"/>
         <w:ind w:firstLine="708"/>
       </w:pPr>
-      <w:bookmarkStart w:id="7" w:name="_Toc173142945"/>
+      <w:bookmarkStart w:id="6" w:name="_Toc173142945"/>
       <w:proofErr w:type="spellStart"/>
       <w:r>
         <w:t>SQLAlchemy</w:t>
@@ -2609,7 +2803,7 @@
       <w:r>
         <w:t>:</w:t>
       </w:r>
-      <w:bookmarkEnd w:id="7"/>
+      <w:bookmarkEnd w:id="6"/>
     </w:p>
     <w:p/>
     <w:p>
@@ -2617,10 +2811,22 @@
         <w:ind w:left="1416"/>
       </w:pPr>
       <w:r>
-        <w:t>Sono presenti in tutto il codice, alcune di queste sono risultate fondamentali per la ricerca, nel creare un nuovo ordine, nel visualizzare il carrello</w:t>
-      </w:r>
-      <w:r>
-        <w:t>, visualizzare gli ordini</w:t>
+        <w:t>Le troviamo</w:t>
+      </w:r>
+      <w:r>
+        <w:t xml:space="preserve"> in tutto il codice, alcune di queste sono risultate fondamentali per la ricerca, nel creare un nuovo ordine, nel visualizzare il carrello</w:t>
+      </w:r>
+      <w:r>
+        <w:t xml:space="preserve">, </w:t>
+      </w:r>
+      <w:r>
+        <w:t xml:space="preserve">nel </w:t>
+      </w:r>
+      <w:r>
+        <w:t>visualizzare gli ordini</w:t>
+      </w:r>
+      <w:r>
+        <w:t>.</w:t>
       </w:r>
     </w:p>
     <w:p>
@@ -3079,7 +3285,13 @@
       </w:r>
       <w:proofErr w:type="spellEnd"/>
       <w:r>
-        <w:t>: ci permette di visualizza lo storico degli ordini effettuati con relativi costi, quantità e nomi dei prodotti</w:t>
+        <w:t>: ci permette di visualizza</w:t>
+      </w:r>
+      <w:r>
+        <w:t>re</w:t>
+      </w:r>
+      <w:r>
+        <w:t xml:space="preserve"> lo storico degli ordini effettuati con relativi costi, quantità e nomi dei prodotti</w:t>
       </w:r>
     </w:p>
     <w:p>
@@ -3093,7 +3305,7 @@
           <w:lang w:eastAsia="it-IT"/>
         </w:rPr>
         <w:drawing>
-          <wp:anchor distT="0" distB="0" distL="114300" distR="114300" simplePos="0" relativeHeight="251666432" behindDoc="0" locked="0" layoutInCell="1" allowOverlap="1" wp14:anchorId="071B9BE4" wp14:editId="49383C11">
+          <wp:anchor distT="0" distB="0" distL="114300" distR="114300" simplePos="0" relativeHeight="251666432" behindDoc="0" locked="0" layoutInCell="1" allowOverlap="1" wp14:anchorId="28ABEE9F" wp14:editId="66EE2566">
             <wp:simplePos x="0" y="0"/>
             <wp:positionH relativeFrom="column">
               <wp:posOffset>1579245</wp:posOffset>
@@ -3151,128 +3363,116 @@
     </w:p>
     <w:p>
       <w:pPr>
-        <w:pStyle w:val="Paragrafoelenco"/>
-        <w:ind w:left="2484"/>
-      </w:pPr>
-    </w:p>
-    <w:p>
-      <w:pPr>
-        <w:pStyle w:val="Paragrafoelenco"/>
-        <w:ind w:left="2484"/>
-      </w:pPr>
-    </w:p>
-    <w:p>
-      <w:pPr>
-        <w:pStyle w:val="Paragrafoelenco"/>
-        <w:ind w:left="2484"/>
-      </w:pPr>
-    </w:p>
-    <w:p>
-      <w:pPr>
-        <w:pStyle w:val="Paragrafoelenco"/>
-        <w:ind w:left="2484"/>
-      </w:pPr>
-    </w:p>
-    <w:p>
-      <w:pPr>
-        <w:pStyle w:val="Paragrafoelenco"/>
-        <w:ind w:left="2484"/>
-      </w:pPr>
-    </w:p>
-    <w:p>
-      <w:pPr>
         <w:pStyle w:val="Titolo2"/>
         <w:numPr>
           <w:ilvl w:val="0"/>
           <w:numId w:val="1"/>
         </w:numPr>
       </w:pPr>
-      <w:bookmarkStart w:id="8" w:name="_Toc173142946"/>
-      <w:r>
+      <w:bookmarkStart w:id="7" w:name="_Toc173142946"/>
+      <w:r>
+        <w:lastRenderedPageBreak/>
         <w:t>PRINCIPALI SCELTE PROGETTUALI</w:t>
       </w:r>
+      <w:bookmarkEnd w:id="7"/>
+    </w:p>
+    <w:p/>
+    <w:p>
+      <w:pPr>
+        <w:ind w:left="708"/>
+      </w:pPr>
+      <w:r>
+        <w:t xml:space="preserve">L’utilizzo dei ruoli (venditore e acquirente) sono stati gestiti tramite </w:t>
+      </w:r>
+      <w:proofErr w:type="spellStart"/>
+      <w:r>
+        <w:t>flask</w:t>
+      </w:r>
+      <w:proofErr w:type="spellEnd"/>
+      <w:r>
+        <w:t xml:space="preserve"> con un</w:t>
+      </w:r>
+      <w:r>
+        <w:t xml:space="preserve">a variabile di tipo </w:t>
+      </w:r>
+      <w:proofErr w:type="spellStart"/>
+      <w:r>
+        <w:t>bool</w:t>
+      </w:r>
+      <w:proofErr w:type="spellEnd"/>
+      <w:r>
+        <w:t xml:space="preserve"> </w:t>
+      </w:r>
+      <w:proofErr w:type="spellStart"/>
+      <w:r>
+        <w:t>is_vend</w:t>
+      </w:r>
+      <w:r>
+        <w:t>itore</w:t>
+      </w:r>
+      <w:proofErr w:type="spellEnd"/>
+      <w:r>
+        <w:t>,</w:t>
+      </w:r>
+      <w:r>
+        <w:t xml:space="preserve"> se è True ci si riferisce al venditore altrimenti all’acquirente.</w:t>
+      </w:r>
+    </w:p>
+    <w:p>
+      <w:pPr>
+        <w:ind w:left="708"/>
+      </w:pPr>
+      <w:r>
+        <w:t xml:space="preserve">I </w:t>
+      </w:r>
+      <w:r>
+        <w:t xml:space="preserve">vincoli di integrità sono stati garantiti tramite l’utilizzo di </w:t>
+      </w:r>
+      <w:proofErr w:type="spellStart"/>
+      <w:r>
+        <w:t>check</w:t>
+      </w:r>
+      <w:proofErr w:type="spellEnd"/>
+      <w:r>
+        <w:t xml:space="preserve"> e trigger nella parte SQL mentre nell’ambito </w:t>
+      </w:r>
+      <w:proofErr w:type="spellStart"/>
+      <w:r>
+        <w:t>python</w:t>
+      </w:r>
+      <w:proofErr w:type="spellEnd"/>
+      <w:r>
+        <w:t xml:space="preserve">, tramite funzioni di </w:t>
+      </w:r>
+      <w:proofErr w:type="spellStart"/>
+      <w:r>
+        <w:t>SQLAlchemy</w:t>
+      </w:r>
+      <w:proofErr w:type="spellEnd"/>
+      <w:r>
+        <w:t xml:space="preserve"> unite a ORM, viene garantita la protezione da </w:t>
+      </w:r>
+      <w:proofErr w:type="spellStart"/>
+      <w:r>
+        <w:t>SQLInjection</w:t>
+      </w:r>
+      <w:proofErr w:type="spellEnd"/>
+      <w:r>
+        <w:t xml:space="preserve">. </w:t>
+      </w:r>
+      <w:r>
+        <w:t>Inoltre</w:t>
+      </w:r>
+      <w:bookmarkStart w:id="8" w:name="_GoBack"/>
       <w:bookmarkEnd w:id="8"/>
-    </w:p>
-    <w:p/>
-    <w:p>
-      <w:pPr>
-        <w:ind w:left="708"/>
-      </w:pPr>
-      <w:r>
-        <w:t xml:space="preserve">L’utilizzo dei ruoli (venditore e acquirente) sono stati gestiti tramite </w:t>
-      </w:r>
-      <w:proofErr w:type="spellStart"/>
-      <w:r>
-        <w:t>flask</w:t>
-      </w:r>
-      <w:proofErr w:type="spellEnd"/>
-      <w:r>
-        <w:t xml:space="preserve"> con un</w:t>
-      </w:r>
-      <w:r>
-        <w:t xml:space="preserve">a variabile di tipo </w:t>
-      </w:r>
-      <w:proofErr w:type="spellStart"/>
-      <w:r>
-        <w:t>bool</w:t>
-      </w:r>
-      <w:proofErr w:type="spellEnd"/>
-      <w:r>
-        <w:t xml:space="preserve"> </w:t>
-      </w:r>
-      <w:proofErr w:type="spellStart"/>
-      <w:r>
-        <w:t>is_vend</w:t>
-      </w:r>
-      <w:r>
-        <w:t>itore</w:t>
-      </w:r>
-      <w:proofErr w:type="spellEnd"/>
-      <w:r>
-        <w:t xml:space="preserve"> che se è True ci si riferisce al venditore altrimenti all’acquirente.</w:t>
-      </w:r>
-    </w:p>
-    <w:p>
-      <w:pPr>
-        <w:ind w:left="708"/>
-      </w:pPr>
-      <w:r>
-        <w:t xml:space="preserve">I </w:t>
-      </w:r>
-      <w:r>
-        <w:t xml:space="preserve">vincoli di integrità sono stati garantiti tramite l’utilizzo di </w:t>
-      </w:r>
-      <w:proofErr w:type="spellStart"/>
-      <w:r>
-        <w:t>check</w:t>
-      </w:r>
-      <w:proofErr w:type="spellEnd"/>
-      <w:r>
-        <w:t xml:space="preserve"> e trigger nella parte SQL mentre nell’ambito </w:t>
-      </w:r>
-      <w:proofErr w:type="spellStart"/>
-      <w:r>
-        <w:t>python</w:t>
-      </w:r>
-      <w:proofErr w:type="spellEnd"/>
-      <w:r>
-        <w:t xml:space="preserve">, tramite funzioni di </w:t>
-      </w:r>
-      <w:proofErr w:type="spellStart"/>
-      <w:r>
-        <w:t>SQLAlchemy</w:t>
-      </w:r>
-      <w:proofErr w:type="spellEnd"/>
-      <w:r>
-        <w:t xml:space="preserve"> unite a ORM, viene garantita la protezione da </w:t>
-      </w:r>
-      <w:proofErr w:type="spellStart"/>
-      <w:r>
-        <w:t>SQLInjection</w:t>
-      </w:r>
-      <w:proofErr w:type="spellEnd"/>
-      <w:r>
-        <w:t>. Mentre tramite l’utilizzo in html di {{ }}, dove vengono passati i dati del database, permetto la protezione da XSS.</w:t>
+      <w:r>
+        <w:t xml:space="preserve"> tramite l’utilizzo in html di {{ }}, dove vengono passati i dati del database, permetto</w:t>
+      </w:r>
+      <w:r>
+        <w:t>no</w:t>
+      </w:r>
+      <w:r>
+        <w:t xml:space="preserve"> la protezione da XSS.</w:t>
       </w:r>
     </w:p>
     <w:p>
@@ -3591,27 +3791,27 @@
         <w:pStyle w:val="Titolo3"/>
       </w:pPr>
       <w:r>
+        <w:tab/>
+      </w:r>
+      <w:bookmarkStart w:id="10" w:name="_Toc173142948"/>
+    </w:p>
+    <w:p>
+      <w:pPr>
+        <w:pStyle w:val="Titolo3"/>
+      </w:pPr>
+    </w:p>
+    <w:p>
+      <w:pPr>
+        <w:pStyle w:val="Titolo3"/>
+      </w:pPr>
+    </w:p>
+    <w:p/>
+    <w:p>
+      <w:pPr>
+        <w:pStyle w:val="Titolo3"/>
+      </w:pPr>
+      <w:r>
         <w:lastRenderedPageBreak/>
-        <w:tab/>
-      </w:r>
-      <w:bookmarkStart w:id="10" w:name="_Toc173142948"/>
-    </w:p>
-    <w:p>
-      <w:pPr>
-        <w:pStyle w:val="Titolo3"/>
-      </w:pPr>
-    </w:p>
-    <w:p>
-      <w:pPr>
-        <w:pStyle w:val="Titolo3"/>
-      </w:pPr>
-    </w:p>
-    <w:p/>
-    <w:p>
-      <w:pPr>
-        <w:pStyle w:val="Titolo3"/>
-      </w:pPr>
-      <w:r>
         <w:t>TRIGGER:</w:t>
       </w:r>
       <w:bookmarkEnd w:id="10"/>
@@ -4008,6 +4208,7 @@
       </w:pPr>
       <w:bookmarkStart w:id="13" w:name="_Toc173142951"/>
       <w:r>
+        <w:lastRenderedPageBreak/>
         <w:t>CONTRIBUTO DEL PROGETTO</w:t>
       </w:r>
       <w:bookmarkEnd w:id="13"/>
@@ -5996,7 +6197,7 @@
 </file>
 
 <file path=customXml/itemProps1.xml><?xml version="1.0" encoding="utf-8"?>
-<ds:datastoreItem xmlns:ds="http://schemas.openxmlformats.org/officeDocument/2006/customXml" ds:itemID="{50C2C127-A242-47EE-A988-1DCE85722804}">
+<ds:datastoreItem xmlns:ds="http://schemas.openxmlformats.org/officeDocument/2006/customXml" ds:itemID="{D66053C3-907F-410B-AB40-1F9AF267FF30}">
   <ds:schemaRefs>
     <ds:schemaRef ds:uri="http://schemas.openxmlformats.org/officeDocument/2006/bibliography"/>
   </ds:schemaRefs>

</xml_diff>

<commit_message>
tentativo non funzionante di dividere visualizzazione venditori
</commit_message>
<xml_diff>
--- a/2023-2024/Basi di Dati/Progetto/RELAZIONE PROGETTO E.docx
+++ b/2023-2024/Basi di Dati/Progetto/RELAZIONE PROGETTO E.docx
@@ -121,7 +121,7 @@
                 <w:noProof/>
                 <w:webHidden/>
               </w:rPr>
-              <w:t>1</w:t>
+              <w:t>2</w:t>
             </w:r>
             <w:r>
               <w:rPr>
@@ -207,7 +207,7 @@
                 <w:noProof/>
                 <w:webHidden/>
               </w:rPr>
-              <w:t>1</w:t>
+              <w:t>3</w:t>
             </w:r>
             <w:r>
               <w:rPr>
@@ -293,7 +293,7 @@
                 <w:noProof/>
                 <w:webHidden/>
               </w:rPr>
-              <w:t>3</w:t>
+              <w:t>5</w:t>
             </w:r>
             <w:r>
               <w:rPr>
@@ -363,7 +363,7 @@
                 <w:noProof/>
                 <w:webHidden/>
               </w:rPr>
-              <w:t>3</w:t>
+              <w:t>5</w:t>
             </w:r>
             <w:r>
               <w:rPr>
@@ -433,7 +433,7 @@
                 <w:noProof/>
                 <w:webHidden/>
               </w:rPr>
-              <w:t>5</w:t>
+              <w:t>7</w:t>
             </w:r>
             <w:r>
               <w:rPr>
@@ -519,7 +519,7 @@
                 <w:noProof/>
                 <w:webHidden/>
               </w:rPr>
-              <w:t>6</w:t>
+              <w:t>8</w:t>
             </w:r>
             <w:r>
               <w:rPr>
@@ -589,7 +589,7 @@
                 <w:noProof/>
                 <w:webHidden/>
               </w:rPr>
-              <w:t>6</w:t>
+              <w:t>8</w:t>
             </w:r>
             <w:r>
               <w:rPr>
@@ -675,7 +675,7 @@
                 <w:noProof/>
                 <w:webHidden/>
               </w:rPr>
-              <w:t>7</w:t>
+              <w:t>9</w:t>
             </w:r>
             <w:r>
               <w:rPr>
@@ -745,7 +745,7 @@
                 <w:noProof/>
                 <w:webHidden/>
               </w:rPr>
-              <w:t>7</w:t>
+              <w:t>9</w:t>
             </w:r>
             <w:r>
               <w:rPr>
@@ -815,7 +815,7 @@
                 <w:noProof/>
                 <w:webHidden/>
               </w:rPr>
-              <w:t>8</w:t>
+              <w:t>10</w:t>
             </w:r>
             <w:r>
               <w:rPr>
@@ -885,7 +885,7 @@
                 <w:noProof/>
                 <w:webHidden/>
               </w:rPr>
-              <w:t>8</w:t>
+              <w:t>10</w:t>
             </w:r>
             <w:r>
               <w:rPr>
@@ -971,7 +971,7 @@
                 <w:noProof/>
                 <w:webHidden/>
               </w:rPr>
-              <w:t>8</w:t>
+              <w:t>10</w:t>
             </w:r>
             <w:r>
               <w:rPr>
@@ -1057,7 +1057,7 @@
                 <w:noProof/>
                 <w:webHidden/>
               </w:rPr>
-              <w:t>9</w:t>
+              <w:t>11</w:t>
             </w:r>
             <w:r>
               <w:rPr>
@@ -6197,7 +6197,7 @@
 </file>
 
 <file path=customXml/itemProps1.xml><?xml version="1.0" encoding="utf-8"?>
-<ds:datastoreItem xmlns:ds="http://schemas.openxmlformats.org/officeDocument/2006/customXml" ds:itemID="{D66053C3-907F-410B-AB40-1F9AF267FF30}">
+<ds:datastoreItem xmlns:ds="http://schemas.openxmlformats.org/officeDocument/2006/customXml" ds:itemID="{A7125E7D-562E-4730-BCA3-CCDB5A86D22B}">
   <ds:schemaRefs>
     <ds:schemaRef ds:uri="http://schemas.openxmlformats.org/officeDocument/2006/bibliography"/>
   </ds:schemaRefs>

</xml_diff>